<commit_message>
Update resume to latest version
</commit_message>
<xml_diff>
--- a/james-matthew-dela-torre-resume.docx
+++ b/james-matthew-dela-torre-resume.docx
@@ -528,18 +528,131 @@
       </w:r>
     </w:p>
     <w:p>
-      <w:pPr>
-        <w:rPr>
-          <w:b/>
-          <w:bCs/>
-        </w:rPr>
-      </w:pPr>
-      <w:r>
-        <w:rPr>
-          <w:b/>
-          <w:bCs/>
-        </w:rPr>
-        <w:t>PROJECTS (GitHub-based)</w:t>
+      <w:r>
+        <w:rPr>
+          <w:b/>
+          <w:sz w:val="22"/>
+        </w:rPr>
+        <w:t>FEATURED PRODUCTION WEBSITES</w:t>
+      </w:r>
+    </w:p>
+    <w:p>
+      <w:r>
+        <w:rPr>
+          <w:b/>
+          <w:sz w:val="21"/>
+        </w:rPr>
+        <w:t>PC BIZPH – Business Website | pcbizph.com</w:t>
+      </w:r>
+    </w:p>
+    <w:p>
+      <w:pPr>
+        <w:numPr>
+          <w:ilvl w:val="0"/>
+          <w:numId w:val="1"/>
+        </w:numPr>
+      </w:pPr>
+      <w:r>
+        <w:rPr>
+          <w:b w:val="0"/>
+          <w:sz w:val="21"/>
+        </w:rPr>
+        <w:t>Designed and built a production business website and digital customer experience for a computer retail business.</w:t>
+      </w:r>
+    </w:p>
+    <w:p>
+      <w:r>
+        <w:rPr>
+          <w:b/>
+          <w:sz w:val="21"/>
+        </w:rPr>
+        <w:t>LNSC Laptops – Multi-Branch Laptop Retail Website | lnsclaptops.com</w:t>
+      </w:r>
+    </w:p>
+    <w:p>
+      <w:pPr>
+        <w:numPr>
+          <w:ilvl w:val="0"/>
+          <w:numId w:val="1"/>
+        </w:numPr>
+      </w:pPr>
+      <w:r>
+        <w:rPr>
+          <w:b w:val="0"/>
+          <w:sz w:val="21"/>
+        </w:rPr>
+        <w:t>Built an e-commerce-focused website supporting a multi-branch laptop retail business.</w:t>
+      </w:r>
+    </w:p>
+    <w:p>
+      <w:r>
+        <w:rPr>
+          <w:b/>
+          <w:sz w:val="21"/>
+        </w:rPr>
+        <w:t>SmartInfo Arellano – University Web Platform &amp; Mobile Application | smartinfoarellano.tech</w:t>
+      </w:r>
+    </w:p>
+    <w:p>
+      <w:pPr>
+        <w:numPr>
+          <w:ilvl w:val="0"/>
+          <w:numId w:val="1"/>
+        </w:numPr>
+      </w:pPr>
+      <w:r>
+        <w:rPr>
+          <w:b w:val="0"/>
+          <w:sz w:val="21"/>
+        </w:rPr>
+        <w:t>Developed a university-focused web platform with a companion mobile application for student-facing information and digital services.</w:t>
+      </w:r>
+    </w:p>
+    <w:p>
+      <w:r>
+        <w:rPr>
+          <w:b/>
+          <w:sz w:val="21"/>
+        </w:rPr>
+        <w:t>ISCC Learn – Online Learning Platform | iscc-learn.online</w:t>
+      </w:r>
+    </w:p>
+    <w:p>
+      <w:pPr>
+        <w:numPr>
+          <w:ilvl w:val="0"/>
+          <w:numId w:val="1"/>
+        </w:numPr>
+      </w:pPr>
+      <w:r>
+        <w:rPr>
+          <w:b w:val="0"/>
+          <w:sz w:val="21"/>
+        </w:rPr>
+        <w:t>Built an education-focused online learning platform for digital course and learning experiences.</w:t>
+      </w:r>
+    </w:p>
+    <w:p>
+      <w:r>
+        <w:rPr>
+          <w:b w:val="0"/>
+          <w:sz w:val="21"/>
+        </w:rPr>
+      </w:r>
+    </w:p>
+    <w:p>
+      <w:pPr>
+        <w:rPr>
+          <w:b/>
+          <w:bCs/>
+        </w:rPr>
+      </w:pPr>
+      <w:r>
+        <w:rPr>
+          <w:b/>
+          <w:sz w:val="22"/>
+        </w:rPr>
+        <w:t>OTHER PROJECTS (GitHub)</w:t>
       </w:r>
     </w:p>
     <w:p>

</xml_diff>